<commit_message>
informe final pdf y word
</commit_message>
<xml_diff>
--- a/Laboratorio/Informe/INFORME LABORATORIO2.docx
+++ b/Laboratorio/Informe/INFORME LABORATORIO2.docx
@@ -66,7 +66,6 @@
     </w:p>
     <w:p>
       <w:pPr>
-        <w:jc w:val="center"/>
         <w:sectPr>
           <w:headerReference w:type="default" r:id="rId8"/>
           <w:headerReference w:type="first" r:id="rId9"/>
@@ -77,46 +76,35 @@
           <w:titlePg/>
         </w:sectPr>
       </w:pPr>
-      <w:hyperlink r:id="rId10">
-        <w:r>
-          <w:rPr>
-            <w:color w:val="1155CC"/>
-            <w:u w:val="single"/>
-          </w:rPr>
-          <w:t>https://github.com/D2-2192296-jhorman/CommII_A1_G10/tree/D2-2192296-jhorman-patch-1</w:t>
-        </w:r>
-      </w:hyperlink>
     </w:p>
     <w:p>
       <w:pPr>
         <w:rPr>
           <w:b/>
+        </w:rPr>
+      </w:pPr>
+      <w:proofErr w:type="spellStart"/>
+      <w:r>
+        <w:rPr>
+          <w:b/>
+        </w:rPr>
+        <w:t>Abstract</w:t>
+      </w:r>
+      <w:proofErr w:type="spellEnd"/>
+    </w:p>
+    <w:p>
+      <w:pPr>
+        <w:spacing w:before="240" w:after="240"/>
+        <w:rPr>
           <w:lang w:val="en-US"/>
         </w:rPr>
       </w:pPr>
       <w:r>
         <w:rPr>
-          <w:b/>
           <w:lang w:val="en-US"/>
         </w:rPr>
-        <w:t>Abstract</w:t>
-      </w:r>
-    </w:p>
-    <w:p>
-      <w:pPr>
-        <w:spacing w:before="240" w:after="240"/>
-        <w:rPr>
-          <w:lang w:val="en-US"/>
-        </w:rPr>
-      </w:pPr>
-      <w:proofErr w:type="gramStart"/>
-      <w:r>
-        <w:rPr>
-          <w:lang w:val="en-US"/>
-        </w:rPr>
-        <w:t>The Power</w:t>
-      </w:r>
-      <w:proofErr w:type="gramEnd"/>
+        <w:t>Power</w:t>
+      </w:r>
       <w:r>
         <w:rPr>
           <w:lang w:val="en-US"/>
@@ -441,7 +429,7 @@
                     <pic:cNvPicPr preferRelativeResize="0"/>
                   </pic:nvPicPr>
                   <pic:blipFill>
-                    <a:blip r:embed="rId11"/>
+                    <a:blip r:embed="rId10"/>
                     <a:srcRect/>
                     <a:stretch>
                       <a:fillRect/>
@@ -548,7 +536,7 @@
                     <pic:cNvPicPr preferRelativeResize="0"/>
                   </pic:nvPicPr>
                   <pic:blipFill>
-                    <a:blip r:embed="rId12"/>
+                    <a:blip r:embed="rId11"/>
                     <a:srcRect/>
                     <a:stretch>
                       <a:fillRect/>
@@ -1778,7 +1766,7 @@
                     <pic:cNvPicPr preferRelativeResize="0"/>
                   </pic:nvPicPr>
                   <pic:blipFill>
-                    <a:blip r:embed="rId13"/>
+                    <a:blip r:embed="rId12"/>
                     <a:srcRect/>
                     <a:stretch>
                       <a:fillRect/>
@@ -1881,7 +1869,7 @@
                     <pic:cNvPicPr preferRelativeResize="0"/>
                   </pic:nvPicPr>
                   <pic:blipFill>
-                    <a:blip r:embed="rId14"/>
+                    <a:blip r:embed="rId13"/>
                     <a:srcRect/>
                     <a:stretch>
                       <a:fillRect/>
@@ -1964,7 +1952,7 @@
                     <pic:cNvPicPr preferRelativeResize="0"/>
                   </pic:nvPicPr>
                   <pic:blipFill>
-                    <a:blip r:embed="rId15"/>
+                    <a:blip r:embed="rId14"/>
                     <a:srcRect/>
                     <a:stretch>
                       <a:fillRect/>
@@ -2063,7 +2051,7 @@
                     <pic:cNvPicPr preferRelativeResize="0"/>
                   </pic:nvPicPr>
                   <pic:blipFill>
-                    <a:blip r:embed="rId16"/>
+                    <a:blip r:embed="rId15"/>
                     <a:srcRect/>
                     <a:stretch>
                       <a:fillRect/>
@@ -2819,7 +2807,7 @@
         <wp:inline distT="114300" distB="114300" distL="114300" distR="114300" wp14:anchorId="07634CEF" wp14:editId="078B32F6">
           <wp:extent cx="6858000" cy="635000"/>
           <wp:effectExtent l="0" t="0" r="0" b="0"/>
-          <wp:docPr id="14" name="image2.png"/>
+          <wp:docPr id="1842563020" name="image2.png"/>
           <wp:cNvGraphicFramePr/>
           <a:graphic xmlns:a="http://schemas.openxmlformats.org/drawingml/2006/main">
             <a:graphicData uri="http://schemas.openxmlformats.org/drawingml/2006/picture">
@@ -2885,7 +2873,7 @@
         <wp:inline distT="114300" distB="114300" distL="114300" distR="114300" wp14:anchorId="022EBB72" wp14:editId="55D9C11B">
           <wp:extent cx="6858000" cy="635000"/>
           <wp:effectExtent l="0" t="0" r="0" b="0"/>
-          <wp:docPr id="11" name="image2.png"/>
+          <wp:docPr id="1525156029" name="image2.png"/>
           <wp:cNvGraphicFramePr/>
           <a:graphic xmlns:a="http://schemas.openxmlformats.org/drawingml/2006/main">
             <a:graphicData uri="http://schemas.openxmlformats.org/drawingml/2006/picture">
@@ -2949,6 +2937,61 @@
     </w:r>
     <w:r>
       <w:t xml:space="preserve"> Delgado - 2195131 Jhan Cárdenas -2184218</w:t>
+    </w:r>
+  </w:p>
+  <w:p>
+    <w:pPr>
+      <w:jc w:val="center"/>
+    </w:pPr>
+    <w:r>
+      <w:drawing>
+        <wp:inline distT="0" distB="0" distL="0" distR="0" wp14:anchorId="1D206452" wp14:editId="2109B090">
+          <wp:extent cx="5615940" cy="335280"/>
+          <wp:effectExtent l="0" t="0" r="0" b="0"/>
+          <wp:docPr id="386843924" name="Imagen 1"/>
+          <wp:cNvGraphicFramePr>
+            <a:graphicFrameLocks xmlns:a="http://schemas.openxmlformats.org/drawingml/2006/main" noChangeAspect="1"/>
+          </wp:cNvGraphicFramePr>
+          <a:graphic xmlns:a="http://schemas.openxmlformats.org/drawingml/2006/main">
+            <a:graphicData uri="http://schemas.openxmlformats.org/drawingml/2006/picture">
+              <pic:pic xmlns:pic="http://schemas.openxmlformats.org/drawingml/2006/picture">
+                <pic:nvPicPr>
+                  <pic:cNvPr id="0" name="Picture 1"/>
+                  <pic:cNvPicPr>
+                    <a:picLocks noChangeAspect="1" noChangeArrowheads="1"/>
+                  </pic:cNvPicPr>
+                </pic:nvPicPr>
+                <pic:blipFill>
+                  <a:blip r:embed="rId2">
+                    <a:extLst>
+                      <a:ext uri="{28A0092B-C50C-407E-A947-70E740481C1C}">
+                        <a14:useLocalDpi xmlns:a14="http://schemas.microsoft.com/office/drawing/2010/main" val="0"/>
+                      </a:ext>
+                    </a:extLst>
+                  </a:blip>
+                  <a:srcRect/>
+                  <a:stretch>
+                    <a:fillRect/>
+                  </a:stretch>
+                </pic:blipFill>
+                <pic:spPr bwMode="auto">
+                  <a:xfrm>
+                    <a:off x="0" y="0"/>
+                    <a:ext cx="5615940" cy="335280"/>
+                  </a:xfrm>
+                  <a:prstGeom prst="rect">
+                    <a:avLst/>
+                  </a:prstGeom>
+                  <a:noFill/>
+                  <a:ln>
+                    <a:noFill/>
+                  </a:ln>
+                </pic:spPr>
+              </pic:pic>
+            </a:graphicData>
+          </a:graphic>
+        </wp:inline>
+      </w:drawing>
     </w:r>
   </w:p>
 </w:hdr>

</xml_diff>